<commit_message>
style: split Material of Construction into its own table
Previously the Material of Construction rows lived at the top of the
Recuperator Designing Parameters table (combined into one tall table).
Now they're a separate, standalone table with an empty paragraph as
visual separator.

Table layout after this change:
  Table 4 -> Material of Construction (23 rows, 3 cols)
  Table 5 -> Recuperator Designing Parameters (16 rows, 3 cols)
  Table 6 -> Price Schedule (was Table 5)

build_recup_template_v2.py:
  - split_material_of_construction() clones Table 4, keeps only
    Designing Params rows in the clone, drops them from the original,
    then inserts the clone right after the (now MoC-only) Table 4.
  - rebuild_price_schedule() now targets by content (looks for
    'ITEM DESCRIPTION' header) so it survives the index shift.

Co-Authored-By: Claude Opus 4.7 (1M context) <noreply@anthropic.com>
</commit_message>
<xml_diff>
--- a/Recup_Offer_Template.docx
+++ b/Recup_Offer_Template.docx
@@ -9153,6 +9153,27 @@
           </w:p>
         </w:tc>
       </w:tr>
+    </w:tbl>
+    <w:p/>
+    <w:tbl>
+      <w:tblPr>
+        <w:tblW w:w="8239" w:type="dxa"/>
+        <w:jc w:val="center"/>
+        <w:tblBorders>
+          <w:top w:val="single" w:sz="4" w:space="0" w:color="auto"/>
+          <w:left w:val="single" w:sz="4" w:space="0" w:color="auto"/>
+          <w:bottom w:val="single" w:sz="4" w:space="0" w:color="auto"/>
+          <w:right w:val="single" w:sz="4" w:space="0" w:color="auto"/>
+          <w:insideH w:val="single" w:sz="4" w:space="0" w:color="auto"/>
+          <w:insideV w:val="single" w:sz="4" w:space="0" w:color="auto"/>
+        </w:tblBorders>
+        <w:tblLook w:val="04A0" w:firstRow="1" w:lastRow="0" w:firstColumn="1" w:lastColumn="0" w:noHBand="0" w:noVBand="1"/>
+      </w:tblPr>
+      <w:tblGrid>
+        <w:gridCol w:w="5913"/>
+        <w:gridCol w:w="1016"/>
+        <w:gridCol w:w="1310"/>
+      </w:tblGrid>
       <w:tr>
         <w:trPr>
           <w:trHeight w:val="361"/>

</xml_diff>

<commit_message>
feat: Recup offer - embed 3D recuperator images in Annexure I
Inserts a "3D Image of the Proposed Recuperator" heading + three
image placeholders after the Designing Parameters table. Backend
populates {{ image_recup_side }}, {{ image_recup_front }},
{{ image_recup_top }} with InlineImage objects rendered at 120 mm
from static/recup/*.jpeg. Missing files fall back to blank rather
than crash the render.

Co-Authored-By: Claude Opus 4.7 (1M context) <noreply@anthropic.com>
</commit_message>
<xml_diff>
--- a/Recup_Offer_Template.docx
+++ b/Recup_Offer_Template.docx
@@ -10477,6 +10477,33 @@
         </w:tc>
       </w:tr>
     </w:tbl>
+    <w:p/>
+    <w:p>
+      <w:r>
+        <w:rPr>
+          <w:b/>
+        </w:rPr>
+        <w:t>3D Image of the Proposed Recuperator</w:t>
+      </w:r>
+    </w:p>
+    <w:p>
+      <w:r>
+        <w:t>{{ image_recup_side }}</w:t>
+      </w:r>
+    </w:p>
+    <w:p/>
+    <w:p>
+      <w:r>
+        <w:t>{{ image_recup_front }}</w:t>
+      </w:r>
+    </w:p>
+    <w:p/>
+    <w:p>
+      <w:r>
+        <w:t>{{ image_recup_top }}</w:t>
+      </w:r>
+    </w:p>
+    <w:p/>
     <w:p/>
     <w:p>
       <w:r>

</xml_diff>

<commit_message>
style: Recup offer - 3D images now sit right before Designing Params
Moved the '3D Image of the Proposed Recuperator' heading + three image
placeholders from after the Designing Parameters table to between the
Material of Construction table and the Designing Parameters table,
so the diagrams render right before the client-given parameter values.

Co-Authored-By: Claude Opus 4.7 (1M context) <noreply@anthropic.com>
</commit_message>
<xml_diff>
--- a/Recup_Offer_Template.docx
+++ b/Recup_Offer_Template.docx
@@ -3344,6 +3344,32 @@
       </w:tr>
     </w:tbl>
     <w:p/>
+    <w:p>
+      <w:r>
+        <w:rPr>
+          <w:b/>
+        </w:rPr>
+        <w:t>3D Image of the Proposed Recuperator</w:t>
+      </w:r>
+    </w:p>
+    <w:p>
+      <w:r>
+        <w:t>{{ image_recup_side }}</w:t>
+      </w:r>
+    </w:p>
+    <w:p/>
+    <w:p>
+      <w:r>
+        <w:t>{{ image_recup_front }}</w:t>
+      </w:r>
+    </w:p>
+    <w:p/>
+    <w:p>
+      <w:r>
+        <w:t>{{ image_recup_top }}</w:t>
+      </w:r>
+    </w:p>
+    <w:p/>
     <w:tbl>
       <w:tblPr>
         <w:tblW w:type="dxa" w:w="9360"/>
@@ -3726,32 +3752,6 @@
         <w:t>Design and material of construction details are listed in the Material of Construction sub-table above. Designing parameters and process flows are listed in the Recuperator Designing Parameters table.</w:t>
       </w:r>
     </w:p>
-    <w:p>
-      <w:r>
-        <w:rPr>
-          <w:b/>
-        </w:rPr>
-        <w:t>3D Image of the Proposed Recuperator</w:t>
-      </w:r>
-    </w:p>
-    <w:p>
-      <w:r>
-        <w:t>{{ image_recup_side }}</w:t>
-      </w:r>
-    </w:p>
-    <w:p/>
-    <w:p>
-      <w:r>
-        <w:t>{{ image_recup_front }}</w:t>
-      </w:r>
-    </w:p>
-    <w:p/>
-    <w:p>
-      <w:r>
-        <w:t>{{ image_recup_top }}</w:t>
-      </w:r>
-    </w:p>
-    <w:p/>
     <w:p>
       <w:pPr>
         <w:pStyle w:val="Heading1"/>

</xml_diff>

<commit_message>
chore: Recup offer Annexure I - smaller polish edits
* Air outlet temperature in the description paragraph now uses the
  {{ air_temp_out_C }} placeholder instead of the hard-coded
  '(300-350) °C' range — flows from Step 2 calc results.
* Dropped '(CS Boiler Grade)' from both hot/cold Bank mentions.
  Sentence reads: 'The tubes are provided for hot Bank and cold Bank.'
* Scope of Supply banner row: just 'Recuperator' (was the longer
  '{{ equipment_name }} — {{ recup_qty }}' string).

Co-Authored-By: Claude Opus 4.7 (1M context) <noreply@anthropic.com>
</commit_message>
<xml_diff>
--- a/Recup_Offer_Template.docx
+++ b/Recup_Offer_Template.docx
@@ -3752,7 +3752,7 @@
     </w:p>
     <w:p>
       <w:r>
-        <w:t xml:space="preserve">The furnace will be provided with a waste heat recovery Recuperator for suitable capacity, which will preheat the combustion air to a temperature of about (300-350) °C, which in turn decreases fuel consumption. Recuperator will be of Convective type having two passes for air and single pass for flue gas. The flue gas will pass over the bank while air passes through the tubes. The tubes for hot Bank (CS Boiler Grade) and cold Bank (CS Boiler Grade). The outer body of the recuperator shall be fabricated from MS plates of suitable thickness so that it may sustain thermal stresses developed during its work. The recuperator will be installed above the ground.</w:t>
+        <w:t xml:space="preserve">The furnace will be provided with a waste heat recovery Recuperator for suitable capacity, which will preheat the combustion air to a temperature of about {{ air_temp_out_C }} °C, which in turn decreases fuel consumption. Recuperator will be of Convective type having two passes for air and single pass for flue gas. The flue gas will pass over the bank while air passes through the tubes. The tubes are provided for hot Bank and cold Bank. The outer body of the recuperator shall be fabricated from MS plates of suitable thickness so that it may sustain thermal stresses developed during its work. The recuperator will be installed above the ground.</w:t>
       </w:r>
     </w:p>
     <w:p/>
@@ -3825,7 +3825,7 @@
               <w:rPr>
                 <w:b/>
               </w:rPr>
-              <w:t>{{ equipment_name }}  —  {{ recup_qty }}</w:t>
+              <w:t>Recuperator</w:t>
             </w:r>
           </w:p>
         </w:tc>

</xml_diff>

<commit_message>
feat: Recup offer - Drive upload + cover-letter / annexures polish
* Auto-upload generated offers to Google Drive: every generated
  DOCX + PDF is now fire-and-forget-pushed to a recup-specific
  Drive folder (hard-coded fallback ID
  1i4wbS9JpSJfC5fJLSgPEv-z1_Dm9Jr2v-, env-var override available
  via GOOGLE_DRIVE_FOLDER_RECUP_ID). Uses existing OAuth refresh
  token (no separate auth flow needed). Failures are logged but
  never break offer generation.

* Cover letter project_name: was 'Recuperator for {application}'
  (e.g. 'Recuperator for 50 TPH Furnace'). Now just 'Recuperator'
  so the cover-letter sentence reads 'enquiry for Recuperator as
  per the technical specifications shared.'

* LIST OF ANNEXURES table on cover page: removed the
  'Annexure VI | Make List | Attached' row since the Annexure VI
  section itself was already stripped out previously.

Co-Authored-By: Claude Opus 4.7 (1M context) <noreply@anthropic.com>
</commit_message>
<xml_diff>
--- a/Recup_Offer_Template.docx
+++ b/Recup_Offer_Template.docx
@@ -1750,112 +1750,6 @@
               <w:right w:val="single" w:color="BFBFBF" w:sz="4"/>
             </w:tcBorders>
             <w:shd w:fill="F3F4F6" w:val="clear"/>
-            <w:tcMar>
-              <w:top w:type="dxa" w:w="100"/>
-              <w:left w:type="dxa" w:w="140"/>
-              <w:bottom w:type="dxa" w:w="100"/>
-              <w:right w:type="dxa" w:w="140"/>
-            </w:tcMar>
-            <w:vAlign w:val="center"/>
-          </w:tcPr>
-          <w:p>
-            <w:pPr>
-              <w:spacing w:after="40" w:before="40"/>
-              <w:jc w:val="center"/>
-            </w:pPr>
-            <w:r>
-              <w:rPr>
-                <w:rFonts w:ascii="Calibri" w:cs="Calibri" w:eastAsia="Calibri" w:hAnsi="Calibri"/>
-                <w:b/>
-                <w:bCs/>
-                <w:color w:val="4CAF50"/>
-                <w:sz w:val="22"/>
-                <w:szCs w:val="22"/>
-              </w:rPr>
-              <w:t xml:space="preserve">Attached</w:t>
-            </w:r>
-          </w:p>
-        </w:tc>
-      </w:tr>
-      <w:tr>
-        <w:tc>
-          <w:tcPr>
-            <w:tcW w:type="dxa" w:w="1800"/>
-            <w:tcBorders>
-              <w:top w:val="single" w:color="BFBFBF" w:sz="4"/>
-              <w:left w:val="single" w:color="BFBFBF" w:sz="4"/>
-              <w:bottom w:val="single" w:color="BFBFBF" w:sz="4"/>
-              <w:right w:val="single" w:color="BFBFBF" w:sz="4"/>
-            </w:tcBorders>
-            <w:shd w:fill="FFFFFF" w:val="clear"/>
-            <w:tcMar>
-              <w:top w:type="dxa" w:w="100"/>
-              <w:left w:type="dxa" w:w="140"/>
-              <w:bottom w:type="dxa" w:w="100"/>
-              <w:right w:type="dxa" w:w="140"/>
-            </w:tcMar>
-            <w:vAlign w:val="center"/>
-          </w:tcPr>
-          <w:p>
-            <w:pPr>
-              <w:spacing w:after="40" w:before="40"/>
-              <w:jc w:val="center"/>
-            </w:pPr>
-            <w:r>
-              <w:rPr>
-                <w:rFonts w:ascii="Calibri" w:cs="Calibri" w:eastAsia="Calibri" w:hAnsi="Calibri"/>
-                <w:b/>
-                <w:bCs/>
-                <w:sz w:val="22"/>
-                <w:szCs w:val="22"/>
-              </w:rPr>
-              <w:t xml:space="preserve">Annexure VI</w:t>
-            </w:r>
-          </w:p>
-        </w:tc>
-        <w:tc>
-          <w:tcPr>
-            <w:tcW w:type="dxa" w:w="5760"/>
-            <w:tcBorders>
-              <w:top w:val="single" w:color="BFBFBF" w:sz="4"/>
-              <w:left w:val="single" w:color="BFBFBF" w:sz="4"/>
-              <w:bottom w:val="single" w:color="BFBFBF" w:sz="4"/>
-              <w:right w:val="single" w:color="BFBFBF" w:sz="4"/>
-            </w:tcBorders>
-            <w:shd w:fill="FFFFFF" w:val="clear"/>
-            <w:tcMar>
-              <w:top w:type="dxa" w:w="100"/>
-              <w:left w:type="dxa" w:w="140"/>
-              <w:bottom w:type="dxa" w:w="100"/>
-              <w:right w:type="dxa" w:w="140"/>
-            </w:tcMar>
-            <w:vAlign w:val="center"/>
-          </w:tcPr>
-          <w:p>
-            <w:pPr>
-              <w:spacing w:after="40" w:before="40"/>
-              <w:jc w:val="left"/>
-            </w:pPr>
-            <w:r>
-              <w:rPr>
-                <w:rFonts w:ascii="Calibri" w:cs="Calibri" w:eastAsia="Calibri" w:hAnsi="Calibri"/>
-                <w:sz w:val="22"/>
-                <w:szCs w:val="22"/>
-              </w:rPr>
-              <w:t xml:space="preserve">Make List</w:t>
-            </w:r>
-          </w:p>
-        </w:tc>
-        <w:tc>
-          <w:tcPr>
-            <w:tcW w:type="dxa" w:w="1800"/>
-            <w:tcBorders>
-              <w:top w:val="single" w:color="BFBFBF" w:sz="4"/>
-              <w:left w:val="single" w:color="BFBFBF" w:sz="4"/>
-              <w:bottom w:val="single" w:color="BFBFBF" w:sz="4"/>
-              <w:right w:val="single" w:color="BFBFBF" w:sz="4"/>
-            </w:tcBorders>
-            <w:shd w:fill="FFFFFF" w:val="clear"/>
             <w:tcMar>
               <w:top w:type="dxa" w:w="100"/>
               <w:left w:type="dxa" w:w="140"/>

</xml_diff>

<commit_message>
chore: remove duplicate 'SCOPE OF SUPPLY' from Tech Specs section
The Tech Specs section had a 'SCOPE OF SUPPLY' heading + intro
paragraph that duplicated Annexure I. Removed the duplicate so
'SCOPE OF SUPPLY' now appears only once in the offer (in Annexure I).
The OPERATION + descriptive paragraphs in Tech Specs are kept.

Co-Authored-By: Claude Opus 4.7 (1M context) <noreply@anthropic.com>
</commit_message>
<xml_diff>
--- a/Recup_Offer_Template.docx
+++ b/Recup_Offer_Template.docx
@@ -3569,19 +3569,6 @@
       </w:pPr>
       <w:r>
         <w:t xml:space="preserve"/>
-      </w:r>
-    </w:p>
-    <w:p>
-      <w:r>
-        <w:rPr>
-          <w:b/>
-        </w:rPr>
-        <w:t>SCOPE OF SUPPLY</w:t>
-      </w:r>
-    </w:p>
-    <w:p>
-      <w:r>
-        <w:t>Our scope of supply will cover design, engineering, manufacturing, supply, and supervision for erection &amp; commissioning of the proposed Recuperator (Waste Heat Recovery System).</w:t>
       </w:r>
     </w:p>
     <w:p>

</xml_diff>

<commit_message>
Recup offer: a line of air under the letterhead rule
The header ended at </w:tbl> — no paragraph after the table at all — so
whatever came first on the page sat hard against the orange rule. The
Designing Parameters heading block touched it; so did the 3D image caption.

The fix is in the header, not the margins: Word starts the body below
whichever is taller, the top margin or the header, and here the header is
the taller one, so raising the margin changes nothing. An empty 12 pt
paragraph now closes the header, which gives the rule a clear line beneath
it on every page it prints.

Co-Authored-By: Claude Opus 5 (1M context) <noreply@anthropic.com>
</commit_message>
<xml_diff>
--- a/Recup_Offer_Template.docx
+++ b/Recup_Offer_Template.docx
@@ -9211,6 +9211,14 @@
       </w:tc>
     </w:tr>
   </w:tbl>
+  <w:p>
+    <w:pPr>
+      <w:spacing w:before="0" w:after="0" w:line="240" w:lineRule="auto"/>
+      <w:rPr>
+        <w:sz w:val="24"/>
+      </w:rPr>
+    </w:pPr>
+  </w:p>
 </w:hdr>
 </file>
 

</xml_diff>